<commit_message>
Add PDF of written assessment and tighten answer spacing
Co-Authored-By: Claude Opus 5.5 <noreply@anthropic.com>
Claude-Session: https://claude.ai/code/session_01NRzMGZ9kXKd2fHiH8YxsZC
</commit_message>
<xml_diff>
--- a/Data_Science_Written_Assessment.docx
+++ b/Data_Science_Written_Assessment.docx
@@ -141,48 +141,6 @@
           <w:b/>
         </w:rPr>
       </w:pPr>
-    </w:p>
-    <w:p>
-      <w:pPr>
-        <w:rPr>
-          <w:b/>
-        </w:rPr>
-      </w:pPr>
-    </w:p>
-    <w:p>
-      <w:pPr>
-        <w:rPr>
-          <w:b/>
-        </w:rPr>
-      </w:pPr>
-    </w:p>
-    <w:p>
-      <w:pPr>
-        <w:rPr>
-          <w:b/>
-        </w:rPr>
-      </w:pPr>
-    </w:p>
-    <w:p>
-      <w:pPr>
-        <w:rPr>
-          <w:b/>
-        </w:rPr>
-      </w:pPr>
-    </w:p>
-    <w:p>
-      <w:pPr>
-        <w:rPr>
-          <w:b/>
-        </w:rPr>
-      </w:pPr>
-    </w:p>
-    <w:p>
-      <w:pPr>
-        <w:rPr>
-          <w:b/>
-        </w:rPr>
-      </w:pPr>
       <w:r>
         <w:rPr>
           <w:b/>
@@ -223,11 +181,6 @@
       <w:r>
         <w:t>Alternatively: ''.join(reversed(s))</w:t>
       </w:r>
-    </w:p>
-    <w:p>
-      <w:pPr>
-        <w:spacing w:after="0"/>
-      </w:pPr>
     </w:p>
     <w:p>
       <w:pPr>
@@ -342,13 +295,48 @@
       <w:pPr>
         <w:spacing w:after="0"/>
       </w:pPr>
+      <w:r>
+        <w:t xml:space="preserve">Q2: What is a NumPy array? </w:t>
+      </w:r>
     </w:p>
     <w:p>
       <w:pPr>
         <w:spacing w:after="0"/>
       </w:pPr>
       <w:r>
-        <w:t xml:space="preserve">Q2: What is a NumPy array? </w:t>
+        <w:t>A NumPy array (ndarray) is NumPy's core data structure: a fixed-size, n-dimensional grid of elements that all share the same data type, stored in contiguous memory.</w:t>
+      </w:r>
+      <w:r>
+        <w:br/>
+      </w:r>
+      <w:r>
+        <w:t>Compared with Python lists it is much faster and more memory-efficient, and it supports vectorised (element-wise) operations, broadcasting, slicing and a large library of mathematical, statistical and linear-algebra functions.</w:t>
+      </w:r>
+      <w:r>
+        <w:br/>
+      </w:r>
+      <w:r>
+        <w:t>Example: import numpy as np; a = np.array([1, 2, 3]); a * 2  -&gt;  array([2, 4, 6])</w:t>
+      </w:r>
+    </w:p>
+    <w:p>
+      <w:pPr>
+        <w:rPr>
+          <w:b/>
+        </w:rPr>
+      </w:pPr>
+    </w:p>
+    <w:p>
+      <w:pPr>
+        <w:rPr>
+          <w:b/>
+        </w:rPr>
+      </w:pPr>
+      <w:r>
+        <w:rPr>
+          <w:b/>
+        </w:rPr>
+        <w:t>SECTION D</w:t>
       </w:r>
     </w:p>
     <w:p>
@@ -356,102 +344,10 @@
         <w:spacing w:after="0"/>
       </w:pPr>
       <w:r>
-        <w:t>A NumPy array (ndarray) is NumPy's core data structure: a fixed-size, n-dimensional grid of elements that all share the same data type, stored in contiguous memory.</w:t>
-      </w:r>
-      <w:r>
-        <w:br/>
-      </w:r>
-      <w:r>
-        <w:t>Compared with Python lists it is much faster and more memory-efficient, and it supports vectorised (element-wise) operations, broadcasting, slicing and a large library of mathematical, statistical and linear-algebra functions.</w:t>
-      </w:r>
-      <w:r>
-        <w:br/>
-      </w:r>
-      <w:r>
-        <w:t>Example: import numpy as np; a = np.array([1, 2, 3]); a * 2  -&gt;  array([2, 4, 6])</w:t>
-      </w:r>
-    </w:p>
-    <w:p>
-      <w:pPr>
-        <w:rPr>
-          <w:b/>
-        </w:rPr>
-      </w:pPr>
-    </w:p>
-    <w:p>
-      <w:pPr>
-        <w:rPr>
-          <w:b/>
-        </w:rPr>
-      </w:pPr>
-    </w:p>
-    <w:p>
-      <w:pPr>
-        <w:rPr>
-          <w:b/>
-        </w:rPr>
-      </w:pPr>
-    </w:p>
-    <w:p>
-      <w:pPr>
-        <w:rPr>
-          <w:b/>
-        </w:rPr>
-      </w:pPr>
-    </w:p>
-    <w:p>
-      <w:pPr>
-        <w:rPr>
-          <w:b/>
-        </w:rPr>
-      </w:pPr>
-    </w:p>
-    <w:p>
-      <w:pPr>
-        <w:rPr>
-          <w:b/>
-        </w:rPr>
-      </w:pPr>
-    </w:p>
-    <w:p>
-      <w:pPr>
-        <w:rPr>
-          <w:b/>
-        </w:rPr>
-      </w:pPr>
-    </w:p>
-    <w:p>
-      <w:pPr>
-        <w:rPr>
-          <w:b/>
-        </w:rPr>
-      </w:pPr>
-    </w:p>
-    <w:p>
-      <w:pPr>
-        <w:rPr>
-          <w:b/>
-        </w:rPr>
-      </w:pPr>
-    </w:p>
-    <w:p>
-      <w:pPr>
-        <w:rPr>
-          <w:b/>
-        </w:rPr>
-      </w:pPr>
-    </w:p>
-    <w:p>
-      <w:pPr>
-        <w:rPr>
-          <w:b/>
-        </w:rPr>
-      </w:pPr>
-      <w:r>
-        <w:rPr>
-          <w:b/>
-        </w:rPr>
-        <w:t>SECTION D</w:t>
+        <w:t>Q1: What is the purpose of exploratory da</w:t>
+      </w:r>
+      <w:r>
+        <w:t>ta analysis?</w:t>
       </w:r>
     </w:p>
     <w:p>
@@ -459,24 +355,8 @@
         <w:spacing w:after="0"/>
       </w:pPr>
       <w:r>
-        <w:t>Q1: What is the purpose of exploratory da</w:t>
-      </w:r>
-      <w:r>
-        <w:t>ta analysis?</w:t>
-      </w:r>
-    </w:p>
-    <w:p>
-      <w:pPr>
-        <w:spacing w:after="0"/>
-      </w:pPr>
-      <w:r>
         <w:t>Exploratory data analysis (EDA) is used to understand a dataset before modelling. Its purpose is to summarise the main characteristics of the data (distributions, central tendency, spread), detect missing values, errors and outliers, uncover patterns, trends and relationships/correlations between variables, check assumptions, and guide feature selection, data cleaning and the choice of model. It is typically done with summary statistics (describe(), info()) and visualisations (histograms, box plots, scatter plots, heatmaps).</w:t>
       </w:r>
-    </w:p>
-    <w:p>
-      <w:pPr>
-        <w:spacing w:after="0"/>
-      </w:pPr>
     </w:p>
     <w:p>
       <w:pPr>
@@ -573,55 +453,6 @@
       <w:r>
         <w:t>where b0 is the intercept and b1..bn are coefficients. The model finds the line (or hyperplane) of best fit by minimising the sum of squared errors between predicted and actual values (Ordinary Least Squares). Simple linear regression uses one feature; multiple linear regression uses several. It is evaluated with metrics such as R², MSE and RMSE – e.g. predicting car price from horsepower, engine size and other features. In Python: sklearn.linear_model.LinearRegression.</w:t>
       </w:r>
-    </w:p>
-    <w:p>
-      <w:pPr>
-        <w:rPr>
-          <w:b/>
-        </w:rPr>
-      </w:pPr>
-    </w:p>
-    <w:p>
-      <w:pPr>
-        <w:rPr>
-          <w:b/>
-        </w:rPr>
-      </w:pPr>
-    </w:p>
-    <w:p>
-      <w:pPr>
-        <w:rPr>
-          <w:b/>
-        </w:rPr>
-      </w:pPr>
-    </w:p>
-    <w:p>
-      <w:pPr>
-        <w:rPr>
-          <w:b/>
-        </w:rPr>
-      </w:pPr>
-    </w:p>
-    <w:p>
-      <w:pPr>
-        <w:rPr>
-          <w:b/>
-        </w:rPr>
-      </w:pPr>
-    </w:p>
-    <w:p>
-      <w:pPr>
-        <w:rPr>
-          <w:b/>
-        </w:rPr>
-      </w:pPr>
-    </w:p>
-    <w:p>
-      <w:pPr>
-        <w:rPr>
-          <w:b/>
-        </w:rPr>
-      </w:pPr>
     </w:p>
     <w:p>
       <w:pPr>

</xml_diff>